<commit_message>
docs: add verified SQL Server evidence
</commit_message>
<xml_diff>
--- a/CMPG223_43700292_Documentation.docx
+++ b/CMPG223_43700292_Documentation.docx
@@ -221,7 +221,7 @@
       <w:r>
         <w:fldChar w:fldCharType="separate"/>
       </w:r>
-      <w:hyperlink w:anchor="_Toc239235387" w:history="1">
+      <w:hyperlink w:anchor="_Toc239241950" w:history="1">
         <w:r>
           <w:rPr>
             <w:rStyle w:val="Hyperlink"/>
@@ -248,7 +248,7 @@
             <w:noProof/>
             <w:webHidden/>
           </w:rPr>
-          <w:instrText xml:space="preserve"> PAGEREF _Toc239235387 \h </w:instrText>
+          <w:instrText xml:space="preserve"> PAGEREF _Toc239241950 \h </w:instrText>
         </w:r>
         <w:r>
           <w:rPr>
@@ -289,7 +289,7 @@
           <w:noProof/>
         </w:rPr>
       </w:pPr>
-      <w:hyperlink w:anchor="_Toc239235388" w:history="1">
+      <w:hyperlink w:anchor="_Toc239241951" w:history="1">
         <w:r>
           <w:rPr>
             <w:rStyle w:val="Hyperlink"/>
@@ -316,7 +316,7 @@
             <w:noProof/>
             <w:webHidden/>
           </w:rPr>
-          <w:instrText xml:space="preserve"> PAGEREF _Toc239235388 \h </w:instrText>
+          <w:instrText xml:space="preserve"> PAGEREF _Toc239241951 \h </w:instrText>
         </w:r>
         <w:r>
           <w:rPr>
@@ -357,7 +357,7 @@
           <w:noProof/>
         </w:rPr>
       </w:pPr>
-      <w:hyperlink w:anchor="_Toc239235389" w:history="1">
+      <w:hyperlink w:anchor="_Toc239241952" w:history="1">
         <w:r>
           <w:rPr>
             <w:rStyle w:val="Hyperlink"/>
@@ -384,7 +384,7 @@
             <w:noProof/>
             <w:webHidden/>
           </w:rPr>
-          <w:instrText xml:space="preserve"> PAGEREF _Toc239235389 \h </w:instrText>
+          <w:instrText xml:space="preserve"> PAGEREF _Toc239241952 \h </w:instrText>
         </w:r>
         <w:r>
           <w:rPr>
@@ -425,7 +425,7 @@
           <w:noProof/>
         </w:rPr>
       </w:pPr>
-      <w:hyperlink w:anchor="_Toc239235390" w:history="1">
+      <w:hyperlink w:anchor="_Toc239241953" w:history="1">
         <w:r>
           <w:rPr>
             <w:rStyle w:val="Hyperlink"/>
@@ -452,7 +452,7 @@
             <w:noProof/>
             <w:webHidden/>
           </w:rPr>
-          <w:instrText xml:space="preserve"> PAGEREF _Toc239235390 \h </w:instrText>
+          <w:instrText xml:space="preserve"> PAGEREF _Toc239241953 \h </w:instrText>
         </w:r>
         <w:r>
           <w:rPr>
@@ -493,7 +493,7 @@
           <w:noProof/>
         </w:rPr>
       </w:pPr>
-      <w:hyperlink w:anchor="_Toc239235391" w:history="1">
+      <w:hyperlink w:anchor="_Toc239241954" w:history="1">
         <w:r>
           <w:rPr>
             <w:rStyle w:val="Hyperlink"/>
@@ -520,7 +520,7 @@
             <w:noProof/>
             <w:webHidden/>
           </w:rPr>
-          <w:instrText xml:space="preserve"> PAGEREF _Toc239235391 \h </w:instrText>
+          <w:instrText xml:space="preserve"> PAGEREF _Toc239241954 \h </w:instrText>
         </w:r>
         <w:r>
           <w:rPr>
@@ -561,7 +561,7 @@
           <w:noProof/>
         </w:rPr>
       </w:pPr>
-      <w:hyperlink w:anchor="_Toc239235392" w:history="1">
+      <w:hyperlink w:anchor="_Toc239241955" w:history="1">
         <w:r>
           <w:rPr>
             <w:rStyle w:val="Hyperlink"/>
@@ -588,7 +588,7 @@
             <w:noProof/>
             <w:webHidden/>
           </w:rPr>
-          <w:instrText xml:space="preserve"> PAGEREF _Toc239235392 \h </w:instrText>
+          <w:instrText xml:space="preserve"> PAGEREF _Toc239241955 \h </w:instrText>
         </w:r>
         <w:r>
           <w:rPr>
@@ -629,7 +629,7 @@
           <w:noProof/>
         </w:rPr>
       </w:pPr>
-      <w:hyperlink w:anchor="_Toc239235393" w:history="1">
+      <w:hyperlink w:anchor="_Toc239241956" w:history="1">
         <w:r>
           <w:rPr>
             <w:rStyle w:val="Hyperlink"/>
@@ -656,7 +656,7 @@
             <w:noProof/>
             <w:webHidden/>
           </w:rPr>
-          <w:instrText xml:space="preserve"> PAGEREF _Toc239235393 \h </w:instrText>
+          <w:instrText xml:space="preserve"> PAGEREF _Toc239241956 \h </w:instrText>
         </w:r>
         <w:r>
           <w:rPr>
@@ -697,7 +697,7 @@
           <w:noProof/>
         </w:rPr>
       </w:pPr>
-      <w:hyperlink w:anchor="_Toc239235394" w:history="1">
+      <w:hyperlink w:anchor="_Toc239241957" w:history="1">
         <w:r>
           <w:rPr>
             <w:rStyle w:val="Hyperlink"/>
@@ -724,7 +724,7 @@
             <w:noProof/>
             <w:webHidden/>
           </w:rPr>
-          <w:instrText xml:space="preserve"> PAGEREF _Toc239235394 \h </w:instrText>
+          <w:instrText xml:space="preserve"> PAGEREF _Toc239241957 \h </w:instrText>
         </w:r>
         <w:r>
           <w:rPr>
@@ -765,7 +765,7 @@
           <w:noProof/>
         </w:rPr>
       </w:pPr>
-      <w:hyperlink w:anchor="_Toc239235395" w:history="1">
+      <w:hyperlink w:anchor="_Toc239241958" w:history="1">
         <w:r>
           <w:rPr>
             <w:rStyle w:val="Hyperlink"/>
@@ -792,7 +792,7 @@
             <w:noProof/>
             <w:webHidden/>
           </w:rPr>
-          <w:instrText xml:space="preserve"> PAGEREF _Toc239235395 \h </w:instrText>
+          <w:instrText xml:space="preserve"> PAGEREF _Toc239241958 \h </w:instrText>
         </w:r>
         <w:r>
           <w:rPr>
@@ -833,7 +833,7 @@
           <w:noProof/>
         </w:rPr>
       </w:pPr>
-      <w:hyperlink w:anchor="_Toc239235396" w:history="1">
+      <w:hyperlink w:anchor="_Toc239241959" w:history="1">
         <w:r>
           <w:rPr>
             <w:rStyle w:val="Hyperlink"/>
@@ -860,7 +860,7 @@
             <w:noProof/>
             <w:webHidden/>
           </w:rPr>
-          <w:instrText xml:space="preserve"> PAGEREF _Toc239235396 \h </w:instrText>
+          <w:instrText xml:space="preserve"> PAGEREF _Toc239241959 \h </w:instrText>
         </w:r>
         <w:r>
           <w:rPr>
@@ -901,7 +901,7 @@
           <w:noProof/>
         </w:rPr>
       </w:pPr>
-      <w:hyperlink w:anchor="_Toc239235397" w:history="1">
+      <w:hyperlink w:anchor="_Toc239241960" w:history="1">
         <w:r>
           <w:rPr>
             <w:rStyle w:val="Hyperlink"/>
@@ -928,7 +928,7 @@
             <w:noProof/>
             <w:webHidden/>
           </w:rPr>
-          <w:instrText xml:space="preserve"> PAGEREF _Toc239235397 \h </w:instrText>
+          <w:instrText xml:space="preserve"> PAGEREF _Toc239241960 \h </w:instrText>
         </w:r>
         <w:r>
           <w:rPr>
@@ -969,7 +969,7 @@
           <w:noProof/>
         </w:rPr>
       </w:pPr>
-      <w:hyperlink w:anchor="_Toc239235398" w:history="1">
+      <w:hyperlink w:anchor="_Toc239241961" w:history="1">
         <w:r>
           <w:rPr>
             <w:rStyle w:val="Hyperlink"/>
@@ -996,7 +996,7 @@
             <w:noProof/>
             <w:webHidden/>
           </w:rPr>
-          <w:instrText xml:space="preserve"> PAGEREF _Toc239235398 \h </w:instrText>
+          <w:instrText xml:space="preserve"> PAGEREF _Toc239241961 \h </w:instrText>
         </w:r>
         <w:r>
           <w:rPr>
@@ -1037,7 +1037,7 @@
           <w:noProof/>
         </w:rPr>
       </w:pPr>
-      <w:hyperlink w:anchor="_Toc239235399" w:history="1">
+      <w:hyperlink w:anchor="_Toc239241962" w:history="1">
         <w:r>
           <w:rPr>
             <w:rStyle w:val="Hyperlink"/>
@@ -1064,143 +1064,7 @@
             <w:noProof/>
             <w:webHidden/>
           </w:rPr>
-          <w:instrText xml:space="preserve"> PAGEREF _Toc239235399 \h </w:instrText>
-        </w:r>
-        <w:r>
-          <w:rPr>
-            <w:noProof/>
-            <w:webHidden/>
-          </w:rPr>
-        </w:r>
-        <w:r>
-          <w:rPr>
-            <w:noProof/>
-            <w:webHidden/>
-          </w:rPr>
-          <w:fldChar w:fldCharType="separate"/>
-        </w:r>
-        <w:r>
-          <w:rPr>
-            <w:noProof/>
-            <w:webHidden/>
-          </w:rPr>
-          <w:t>18</w:t>
-        </w:r>
-        <w:r>
-          <w:rPr>
-            <w:noProof/>
-            <w:webHidden/>
-          </w:rPr>
-          <w:fldChar w:fldCharType="end"/>
-        </w:r>
-      </w:hyperlink>
-    </w:p>
-    <w:p>
-      <w:pPr>
-        <w:pStyle w:val="TOC1"/>
-        <w:tabs>
-          <w:tab w:val="right" w:leader="dot" w:pos="9739"/>
-        </w:tabs>
-        <w:rPr>
-          <w:noProof/>
-        </w:rPr>
-      </w:pPr>
-      <w:hyperlink w:anchor="_Toc239235400" w:history="1">
-        <w:r>
-          <w:rPr>
-            <w:rStyle w:val="Hyperlink"/>
-            <w:noProof/>
-          </w:rPr>
-          <w:t>14  Demonstration guide</w:t>
-        </w:r>
-        <w:r>
-          <w:rPr>
-            <w:noProof/>
-            <w:webHidden/>
-          </w:rPr>
-          <w:tab/>
-        </w:r>
-        <w:r>
-          <w:rPr>
-            <w:noProof/>
-            <w:webHidden/>
-          </w:rPr>
-          <w:fldChar w:fldCharType="begin"/>
-        </w:r>
-        <w:r>
-          <w:rPr>
-            <w:noProof/>
-            <w:webHidden/>
-          </w:rPr>
-          <w:instrText xml:space="preserve"> PAGEREF _Toc239235400 \h </w:instrText>
-        </w:r>
-        <w:r>
-          <w:rPr>
-            <w:noProof/>
-            <w:webHidden/>
-          </w:rPr>
-        </w:r>
-        <w:r>
-          <w:rPr>
-            <w:noProof/>
-            <w:webHidden/>
-          </w:rPr>
-          <w:fldChar w:fldCharType="separate"/>
-        </w:r>
-        <w:r>
-          <w:rPr>
-            <w:noProof/>
-            <w:webHidden/>
-          </w:rPr>
-          <w:t>19</w:t>
-        </w:r>
-        <w:r>
-          <w:rPr>
-            <w:noProof/>
-            <w:webHidden/>
-          </w:rPr>
-          <w:fldChar w:fldCharType="end"/>
-        </w:r>
-      </w:hyperlink>
-    </w:p>
-    <w:p>
-      <w:pPr>
-        <w:pStyle w:val="TOC1"/>
-        <w:tabs>
-          <w:tab w:val="right" w:leader="dot" w:pos="9739"/>
-        </w:tabs>
-        <w:rPr>
-          <w:noProof/>
-        </w:rPr>
-      </w:pPr>
-      <w:hyperlink w:anchor="_Toc239235401" w:history="1">
-        <w:r>
-          <w:rPr>
-            <w:rStyle w:val="Hyperlink"/>
-            <w:noProof/>
-          </w:rPr>
-          <w:t>15  Conclusion</w:t>
-        </w:r>
-        <w:r>
-          <w:rPr>
-            <w:noProof/>
-            <w:webHidden/>
-          </w:rPr>
-          <w:tab/>
-        </w:r>
-        <w:r>
-          <w:rPr>
-            <w:noProof/>
-            <w:webHidden/>
-          </w:rPr>
-          <w:fldChar w:fldCharType="begin"/>
-        </w:r>
-        <w:r>
-          <w:rPr>
-            <w:noProof/>
-            <w:webHidden/>
-          </w:rPr>
-          <w:instrText xml:space="preserve"> PAGEREF _Toc239235401 \h </w:instrText>
+          <w:instrText xml:space="preserve"> PAGEREF _Toc239241962 \h </w:instrText>
         </w:r>
         <w:r>
           <w:rPr>
@@ -1233,6 +1097,142 @@
     </w:p>
     <w:p>
       <w:pPr>
+        <w:pStyle w:val="TOC1"/>
+        <w:tabs>
+          <w:tab w:val="right" w:leader="dot" w:pos="9739"/>
+        </w:tabs>
+        <w:rPr>
+          <w:noProof/>
+        </w:rPr>
+      </w:pPr>
+      <w:hyperlink w:anchor="_Toc239241963" w:history="1">
+        <w:r>
+          <w:rPr>
+            <w:rStyle w:val="Hyperlink"/>
+            <w:noProof/>
+          </w:rPr>
+          <w:t>14  Demonstration guide</w:t>
+        </w:r>
+        <w:r>
+          <w:rPr>
+            <w:noProof/>
+            <w:webHidden/>
+          </w:rPr>
+          <w:tab/>
+        </w:r>
+        <w:r>
+          <w:rPr>
+            <w:noProof/>
+            <w:webHidden/>
+          </w:rPr>
+          <w:fldChar w:fldCharType="begin"/>
+        </w:r>
+        <w:r>
+          <w:rPr>
+            <w:noProof/>
+            <w:webHidden/>
+          </w:rPr>
+          <w:instrText xml:space="preserve"> PAGEREF _Toc239241963 \h </w:instrText>
+        </w:r>
+        <w:r>
+          <w:rPr>
+            <w:noProof/>
+            <w:webHidden/>
+          </w:rPr>
+        </w:r>
+        <w:r>
+          <w:rPr>
+            <w:noProof/>
+            <w:webHidden/>
+          </w:rPr>
+          <w:fldChar w:fldCharType="separate"/>
+        </w:r>
+        <w:r>
+          <w:rPr>
+            <w:noProof/>
+            <w:webHidden/>
+          </w:rPr>
+          <w:t>21</w:t>
+        </w:r>
+        <w:r>
+          <w:rPr>
+            <w:noProof/>
+            <w:webHidden/>
+          </w:rPr>
+          <w:fldChar w:fldCharType="end"/>
+        </w:r>
+      </w:hyperlink>
+    </w:p>
+    <w:p>
+      <w:pPr>
+        <w:pStyle w:val="TOC1"/>
+        <w:tabs>
+          <w:tab w:val="right" w:leader="dot" w:pos="9739"/>
+        </w:tabs>
+        <w:rPr>
+          <w:noProof/>
+        </w:rPr>
+      </w:pPr>
+      <w:hyperlink w:anchor="_Toc239241964" w:history="1">
+        <w:r>
+          <w:rPr>
+            <w:rStyle w:val="Hyperlink"/>
+            <w:noProof/>
+          </w:rPr>
+          <w:t>15  Conclusion</w:t>
+        </w:r>
+        <w:r>
+          <w:rPr>
+            <w:noProof/>
+            <w:webHidden/>
+          </w:rPr>
+          <w:tab/>
+        </w:r>
+        <w:r>
+          <w:rPr>
+            <w:noProof/>
+            <w:webHidden/>
+          </w:rPr>
+          <w:fldChar w:fldCharType="begin"/>
+        </w:r>
+        <w:r>
+          <w:rPr>
+            <w:noProof/>
+            <w:webHidden/>
+          </w:rPr>
+          <w:instrText xml:space="preserve"> PAGEREF _Toc239241964 \h </w:instrText>
+        </w:r>
+        <w:r>
+          <w:rPr>
+            <w:noProof/>
+            <w:webHidden/>
+          </w:rPr>
+        </w:r>
+        <w:r>
+          <w:rPr>
+            <w:noProof/>
+            <w:webHidden/>
+          </w:rPr>
+          <w:fldChar w:fldCharType="separate"/>
+        </w:r>
+        <w:r>
+          <w:rPr>
+            <w:noProof/>
+            <w:webHidden/>
+          </w:rPr>
+          <w:t>22</w:t>
+        </w:r>
+        <w:r>
+          <w:rPr>
+            <w:noProof/>
+            <w:webHidden/>
+          </w:rPr>
+          <w:fldChar w:fldCharType="end"/>
+        </w:r>
+      </w:hyperlink>
+    </w:p>
+    <w:p>
+      <w:pPr>
         <w:spacing w:after="0"/>
       </w:pPr>
       <w:r>
@@ -1243,7 +1243,7 @@
       <w:pPr>
         <w:pStyle w:val="Heading1"/>
       </w:pPr>
-      <w:bookmarkStart w:id="0" w:name="_Toc239235387"/>
+      <w:bookmarkStart w:id="0" w:name="_Toc239241950"/>
       <w:r>
         <w:lastRenderedPageBreak/>
         <w:t>1  Project overview</w:t>
@@ -1851,7 +1851,7 @@
       <w:pPr>
         <w:pStyle w:val="Heading1"/>
       </w:pPr>
-      <w:bookmarkStart w:id="1" w:name="_Toc239235388"/>
+      <w:bookmarkStart w:id="1" w:name="_Toc239241951"/>
       <w:r>
         <w:lastRenderedPageBreak/>
         <w:t>2  Application architecture</w:t>
@@ -1868,10 +1868,10 @@
           <w:noProof/>
         </w:rPr>
         <w:drawing>
-          <wp:inline distT="0" distB="0" distL="0" distR="0" wp14:anchorId="6A1B9C58" wp14:editId="4049CC83">
+          <wp:inline distT="0" distB="0" distL="0" distR="0" wp14:anchorId="40EB028E" wp14:editId="12CDEAB7">
             <wp:extent cx="6080760" cy="2330958"/>
             <wp:effectExtent l="0" t="0" r="0" b="0"/>
-            <wp:docPr id="1" name="Picture 1"/>
+            <wp:docPr id="1" name="Picture 1" title="Figure 1" descr="Figure 1. Application layers and the single configuration boundary."/>
             <wp:cNvGraphicFramePr>
               <a:graphicFrameLocks xmlns:a="http://schemas.openxmlformats.org/drawingml/2006/main" noChangeAspect="1"/>
             </wp:cNvGraphicFramePr>
@@ -1928,10 +1928,10 @@
           <w:noProof/>
         </w:rPr>
         <w:drawing>
-          <wp:inline distT="0" distB="0" distL="0" distR="0" wp14:anchorId="6A3790AF" wp14:editId="70B67445">
+          <wp:inline distT="0" distB="0" distL="0" distR="0" wp14:anchorId="00B21BE4" wp14:editId="4BE4B027">
             <wp:extent cx="3886200" cy="4221480"/>
             <wp:effectExtent l="0" t="0" r="0" b="0"/>
-            <wp:docPr id="2" name="Picture 2"/>
+            <wp:docPr id="2" name="Picture 2" title="Figure 2" descr="Figure 2. Home screen with access to all maintenance, reporting and help functions."/>
             <wp:cNvGraphicFramePr>
               <a:graphicFrameLocks xmlns:a="http://schemas.openxmlformats.org/drawingml/2006/main" noChangeAspect="1"/>
             </wp:cNvGraphicFramePr>
@@ -1977,7 +1977,7 @@
       <w:pPr>
         <w:pStyle w:val="Heading1"/>
       </w:pPr>
-      <w:bookmarkStart w:id="2" w:name="_Toc239235389"/>
+      <w:bookmarkStart w:id="2" w:name="_Toc239241952"/>
       <w:r>
         <w:lastRenderedPageBreak/>
         <w:t>3  Physical data model</w:t>
@@ -1994,10 +1994,10 @@
           <w:noProof/>
         </w:rPr>
         <w:drawing>
-          <wp:inline distT="0" distB="0" distL="0" distR="0" wp14:anchorId="22976E15" wp14:editId="2666EE94">
+          <wp:inline distT="0" distB="0" distL="0" distR="0" wp14:anchorId="1F469619" wp14:editId="71F8F86C">
             <wp:extent cx="6126480" cy="3522726"/>
             <wp:effectExtent l="0" t="0" r="0" b="0"/>
-            <wp:docPr id="3" name="Picture 3"/>
+            <wp:docPr id="3" name="Picture 3" title="Figure 3" descr="Figure 3. Authoritative five-table physical data model."/>
             <wp:cNvGraphicFramePr>
               <a:graphicFrameLocks xmlns:a="http://schemas.openxmlformats.org/drawingml/2006/main" noChangeAspect="1"/>
             </wp:cNvGraphicFramePr>
@@ -2731,7 +2731,7 @@
       <w:pPr>
         <w:pStyle w:val="Heading1"/>
       </w:pPr>
-      <w:bookmarkStart w:id="3" w:name="_Toc239235390"/>
+      <w:bookmarkStart w:id="3" w:name="_Toc239241953"/>
       <w:r>
         <w:lastRenderedPageBreak/>
         <w:t>4  Data dictionary</w:t>
@@ -7152,7 +7152,7 @@
       <w:pPr>
         <w:pStyle w:val="Heading1"/>
       </w:pPr>
-      <w:bookmarkStart w:id="4" w:name="_Toc239235391"/>
+      <w:bookmarkStart w:id="4" w:name="_Toc239241954"/>
       <w:r>
         <w:lastRenderedPageBreak/>
         <w:t>5  Physical process model</w:t>
@@ -7169,10 +7169,10 @@
           <w:noProof/>
         </w:rPr>
         <w:drawing>
-          <wp:inline distT="0" distB="0" distL="0" distR="0" wp14:anchorId="55DB5A2A" wp14:editId="5B1ED226">
+          <wp:inline distT="0" distB="0" distL="0" distR="0" wp14:anchorId="775F420A" wp14:editId="1C756EC0">
             <wp:extent cx="6126480" cy="3956685"/>
             <wp:effectExtent l="0" t="0" r="0" b="0"/>
-            <wp:docPr id="4" name="Picture 4"/>
+            <wp:docPr id="4" name="Picture 4" title="Figure 4" descr="Figure 4. Two maintenance processes and two business processes."/>
             <wp:cNvGraphicFramePr>
               <a:graphicFrameLocks xmlns:a="http://schemas.openxmlformats.org/drawingml/2006/main" noChangeAspect="1"/>
             </wp:cNvGraphicFramePr>
@@ -7864,7 +7864,7 @@
       <w:pPr>
         <w:pStyle w:val="Heading1"/>
       </w:pPr>
-      <w:bookmarkStart w:id="5" w:name="_Toc239235392"/>
+      <w:bookmarkStart w:id="5" w:name="_Toc239241955"/>
       <w:r>
         <w:lastRenderedPageBreak/>
         <w:t>6  Database implementation</w:t>
@@ -8693,7 +8693,7 @@
       <w:pPr>
         <w:pStyle w:val="Heading1"/>
       </w:pPr>
-      <w:bookmarkStart w:id="6" w:name="_Toc239235393"/>
+      <w:bookmarkStart w:id="6" w:name="_Toc239241956"/>
       <w:r>
         <w:lastRenderedPageBreak/>
         <w:t>7  Application code and reuse</w:t>
@@ -8718,10 +8718,10 @@
           <w:noProof/>
         </w:rPr>
         <w:drawing>
-          <wp:inline distT="0" distB="0" distL="0" distR="0" wp14:anchorId="4870F44A" wp14:editId="305897B8">
+          <wp:inline distT="0" distB="0" distL="0" distR="0" wp14:anchorId="60266BA1" wp14:editId="3CFBDBF3">
             <wp:extent cx="6126480" cy="1863471"/>
             <wp:effectExtent l="0" t="0" r="0" b="0"/>
-            <wp:docPr id="5" name="Picture 5"/>
+            <wp:docPr id="5" name="Picture 5" title="Figure 5" descr="Figure 5. Query helper used by all forms; resources are disposed by nested using blocks."/>
             <wp:cNvGraphicFramePr>
               <a:graphicFrameLocks xmlns:a="http://schemas.openxmlformats.org/drawingml/2006/main" noChangeAspect="1"/>
             </wp:cNvGraphicFramePr>
@@ -8791,10 +8791,10 @@
           <w:noProof/>
         </w:rPr>
         <w:drawing>
-          <wp:inline distT="0" distB="0" distL="0" distR="0" wp14:anchorId="51C149B4" wp14:editId="7F3572C0">
+          <wp:inline distT="0" distB="0" distL="0" distR="0" wp14:anchorId="2531D8AA" wp14:editId="0451AE01">
             <wp:extent cx="6126480" cy="3091319"/>
             <wp:effectExtent l="0" t="0" r="0" b="0"/>
-            <wp:docPr id="6" name="Picture 6"/>
+            <wp:docPr id="6" name="Picture 6" title="Figure 6" descr="Figure 6. Event creation reuses cost, conflict and stored-procedure helpers."/>
             <wp:cNvGraphicFramePr>
               <a:graphicFrameLocks xmlns:a="http://schemas.openxmlformats.org/drawingml/2006/main" noChangeAspect="1"/>
             </wp:cNvGraphicFramePr>
@@ -8847,10 +8847,10 @@
         </w:rPr>
         <w:lastRenderedPageBreak/>
         <w:drawing>
-          <wp:inline distT="0" distB="0" distL="0" distR="0" wp14:anchorId="40803353" wp14:editId="113DCF7F">
+          <wp:inline distT="0" distB="0" distL="0" distR="0" wp14:anchorId="4C8D1156" wp14:editId="5ADEFA31">
             <wp:extent cx="5943600" cy="4278911"/>
             <wp:effectExtent l="0" t="0" r="0" b="0"/>
-            <wp:docPr id="7" name="Picture 7"/>
+            <wp:docPr id="7" name="Picture 7" title="Figure 7" descr="Figure 7. EVENTS child-entity maintenance screen with CRUD tabs."/>
             <wp:cNvGraphicFramePr>
               <a:graphicFrameLocks xmlns:a="http://schemas.openxmlformats.org/drawingml/2006/main" noChangeAspect="1"/>
             </wp:cNvGraphicFramePr>
@@ -9241,7 +9241,7 @@
       <w:pPr>
         <w:pStyle w:val="Heading1"/>
       </w:pPr>
-      <w:bookmarkStart w:id="7" w:name="_Toc239235394"/>
+      <w:bookmarkStart w:id="7" w:name="_Toc239241957"/>
       <w:r>
         <w:lastRenderedPageBreak/>
         <w:t>8  Validation and business rules</w:t>
@@ -10277,7 +10277,7 @@
       <w:pPr>
         <w:pStyle w:val="Heading1"/>
       </w:pPr>
-      <w:bookmarkStart w:id="8" w:name="_Toc239235395"/>
+      <w:bookmarkStart w:id="8" w:name="_Toc239241958"/>
       <w:r>
         <w:lastRenderedPageBreak/>
         <w:t>9  Integrated help assistant</w:t>
@@ -10299,10 +10299,10 @@
           <w:noProof/>
         </w:rPr>
         <w:drawing>
-          <wp:inline distT="0" distB="0" distL="0" distR="0" wp14:anchorId="0B4DF489" wp14:editId="48AAE47D">
+          <wp:inline distT="0" distB="0" distL="0" distR="0" wp14:anchorId="3730FD7F" wp14:editId="6D79C6DA">
             <wp:extent cx="6080760" cy="4380341"/>
             <wp:effectExtent l="0" t="0" r="0" b="0"/>
-            <wp:docPr id="8" name="Picture 8"/>
+            <wp:docPr id="8" name="Picture 8" title="Figure 8" descr="Figure 8. Help Assistant answering a booking question inside the application."/>
             <wp:cNvGraphicFramePr>
               <a:graphicFrameLocks xmlns:a="http://schemas.openxmlformats.org/drawingml/2006/main" noChangeAspect="1"/>
             </wp:cNvGraphicFramePr>
@@ -10381,10 +10381,10 @@
           <w:noProof/>
         </w:rPr>
         <w:drawing>
-          <wp:inline distT="0" distB="0" distL="0" distR="0" wp14:anchorId="5F0C7C81" wp14:editId="7D114CAF">
+          <wp:inline distT="0" distB="0" distL="0" distR="0" wp14:anchorId="73CE919A" wp14:editId="56B4BD40">
             <wp:extent cx="6126480" cy="2902420"/>
             <wp:effectExtent l="0" t="0" r="0" b="0"/>
-            <wp:docPr id="9" name="Picture 9"/>
+            <wp:docPr id="9" name="Picture 9" title="Figure 9" descr="Figure 9. Readable keyword-scoring logic used by the offline chatbot."/>
             <wp:cNvGraphicFramePr>
               <a:graphicFrameLocks xmlns:a="http://schemas.openxmlformats.org/drawingml/2006/main" noChangeAspect="1"/>
             </wp:cNvGraphicFramePr>
@@ -10838,7 +10838,7 @@
       <w:pPr>
         <w:pStyle w:val="Heading1"/>
       </w:pPr>
-      <w:bookmarkStart w:id="9" w:name="_Toc239235396"/>
+      <w:bookmarkStart w:id="9" w:name="_Toc239241959"/>
       <w:r>
         <w:lastRenderedPageBreak/>
         <w:t>10  Reports</w:t>
@@ -11197,10 +11197,10 @@
           <w:noProof/>
         </w:rPr>
         <w:drawing>
-          <wp:inline distT="0" distB="0" distL="0" distR="0" wp14:anchorId="1BB7BE07" wp14:editId="7301CE1C">
+          <wp:inline distT="0" distB="0" distL="0" distR="0" wp14:anchorId="6ECD2746" wp14:editId="4F689F44">
             <wp:extent cx="6126480" cy="4068312"/>
             <wp:effectExtent l="0" t="0" r="0" b="0"/>
-            <wp:docPr id="10" name="Picture 10"/>
+            <wp:docPr id="10" name="Picture 10" title="Figure 10" descr="Figure 10. Highest-value events report with ordering by event value."/>
             <wp:cNvGraphicFramePr>
               <a:graphicFrameLocks xmlns:a="http://schemas.openxmlformats.org/drawingml/2006/main" noChangeAspect="1"/>
             </wp:cNvGraphicFramePr>
@@ -11253,10 +11253,10 @@
         </w:rPr>
         <w:lastRenderedPageBreak/>
         <w:drawing>
-          <wp:inline distT="0" distB="0" distL="0" distR="0" wp14:anchorId="274CF186" wp14:editId="4DDA6424">
+          <wp:inline distT="0" distB="0" distL="0" distR="0" wp14:anchorId="7BB2D0D6" wp14:editId="1602997B">
             <wp:extent cx="6126480" cy="4068312"/>
             <wp:effectExtent l="0" t="0" r="0" b="0"/>
-            <wp:docPr id="11" name="Picture 11"/>
+            <wp:docPr id="11" name="Picture 11" title="Figure 11" descr="Figure 11. Highest-spending clients summary using COUNT and SUM."/>
             <wp:cNvGraphicFramePr>
               <a:graphicFrameLocks xmlns:a="http://schemas.openxmlformats.org/drawingml/2006/main" noChangeAspect="1"/>
             </wp:cNvGraphicFramePr>
@@ -11302,7 +11302,7 @@
       <w:pPr>
         <w:pStyle w:val="Heading1"/>
       </w:pPr>
-      <w:bookmarkStart w:id="10" w:name="_Toc239235397"/>
+      <w:bookmarkStart w:id="10" w:name="_Toc239241960"/>
       <w:r>
         <w:lastRenderedPageBreak/>
         <w:t>11  User manual</w:t>
@@ -12435,7 +12435,7 @@
       <w:pPr>
         <w:pStyle w:val="Heading1"/>
       </w:pPr>
-      <w:bookmarkStart w:id="11" w:name="_Toc239235398"/>
+      <w:bookmarkStart w:id="11" w:name="_Toc239241961"/>
       <w:r>
         <w:lastRenderedPageBreak/>
         <w:t>12  Verification</w:t>
@@ -13217,10 +13217,250 @@
       </w:pPr>
     </w:p>
     <w:p>
+      <w:r>
+        <w:br w:type="page"/>
+      </w:r>
+    </w:p>
+    <w:p>
+      <w:pPr>
+        <w:pStyle w:val="Heading2"/>
+      </w:pPr>
+      <w:r>
+        <w:lastRenderedPageBreak/>
+        <w:t>SQL Server evidence</w:t>
+      </w:r>
+    </w:p>
+    <w:p>
+      <w:r>
+        <w:t>The following SQL Server Management Studio screens were captured from the verified (LocalDB)\MSSQLLocalDB instance. Each screen includes the read-only query used to produce the evidence, so the table inventory, relationships and representative data can be reproduced directly from the submitted setup script.</w:t>
+      </w:r>
+    </w:p>
+    <w:p>
+      <w:pPr>
+        <w:spacing w:after="0"/>
+        <w:jc w:val="center"/>
+      </w:pPr>
+      <w:r>
+        <w:rPr>
+          <w:noProof/>
+        </w:rPr>
+        <w:drawing>
+          <wp:inline distT="0" distB="0" distL="0" distR="0" wp14:anchorId="7CC6C159" wp14:editId="6FF45FFA">
+            <wp:extent cx="6126480" cy="3254692"/>
+            <wp:effectExtent l="0" t="0" r="0" b="0"/>
+            <wp:docPr id="12" name="Picture 12" title="Figure 12" descr="Figure 12. SSMS confirms the five required tables and four seeded rows per table."/>
+            <wp:cNvGraphicFramePr>
+              <a:graphicFrameLocks xmlns:a="http://schemas.openxmlformats.org/drawingml/2006/main" noChangeAspect="1"/>
+            </wp:cNvGraphicFramePr>
+            <a:graphic xmlns:a="http://schemas.openxmlformats.org/drawingml/2006/main">
+              <a:graphicData uri="http://schemas.openxmlformats.org/drawingml/2006/picture">
+                <pic:pic xmlns:pic="http://schemas.openxmlformats.org/drawingml/2006/picture">
+                  <pic:nvPicPr>
+                    <pic:cNvPr id="0" name="02-five-table-summary.png"/>
+                    <pic:cNvPicPr/>
+                  </pic:nvPicPr>
+                  <pic:blipFill>
+                    <a:blip r:embed="rId19"/>
+                    <a:stretch>
+                      <a:fillRect/>
+                    </a:stretch>
+                  </pic:blipFill>
+                  <pic:spPr>
+                    <a:xfrm>
+                      <a:off x="0" y="0"/>
+                      <a:ext cx="6126480" cy="3254692"/>
+                    </a:xfrm>
+                    <a:prstGeom prst="rect">
+                      <a:avLst/>
+                    </a:prstGeom>
+                  </pic:spPr>
+                </pic:pic>
+              </a:graphicData>
+            </a:graphic>
+          </wp:inline>
+        </w:drawing>
+      </w:r>
+    </w:p>
+    <w:p>
+      <w:pPr>
+        <w:pStyle w:val="Caption"/>
+        <w:jc w:val="center"/>
+      </w:pPr>
+      <w:r>
+        <w:t>Figure 12. SSMS confirms the five required tables and four seeded rows per table.</w:t>
+      </w:r>
+    </w:p>
+    <w:p>
+      <w:pPr>
+        <w:spacing w:after="0"/>
+        <w:jc w:val="center"/>
+      </w:pPr>
+      <w:r>
+        <w:rPr>
+          <w:noProof/>
+        </w:rPr>
+        <w:drawing>
+          <wp:inline distT="0" distB="0" distL="0" distR="0" wp14:anchorId="0D12E259" wp14:editId="288232CC">
+            <wp:extent cx="6126480" cy="2904554"/>
+            <wp:effectExtent l="0" t="0" r="0" b="0"/>
+            <wp:docPr id="13" name="Picture 13" title="Figure 13" descr="Figure 13. SSMS foreign-key evidence for EVENTS and PARTNERS."/>
+            <wp:cNvGraphicFramePr>
+              <a:graphicFrameLocks xmlns:a="http://schemas.openxmlformats.org/drawingml/2006/main" noChangeAspect="1"/>
+            </wp:cNvGraphicFramePr>
+            <a:graphic xmlns:a="http://schemas.openxmlformats.org/drawingml/2006/main">
+              <a:graphicData uri="http://schemas.openxmlformats.org/drawingml/2006/picture">
+                <pic:pic xmlns:pic="http://schemas.openxmlformats.org/drawingml/2006/picture">
+                  <pic:nvPicPr>
+                    <pic:cNvPr id="0" name="05-foreign-key-relationships.png"/>
+                    <pic:cNvPicPr/>
+                  </pic:nvPicPr>
+                  <pic:blipFill>
+                    <a:blip r:embed="rId20"/>
+                    <a:stretch>
+                      <a:fillRect/>
+                    </a:stretch>
+                  </pic:blipFill>
+                  <pic:spPr>
+                    <a:xfrm>
+                      <a:off x="0" y="0"/>
+                      <a:ext cx="6126480" cy="2904554"/>
+                    </a:xfrm>
+                    <a:prstGeom prst="rect">
+                      <a:avLst/>
+                    </a:prstGeom>
+                  </pic:spPr>
+                </pic:pic>
+              </a:graphicData>
+            </a:graphic>
+          </wp:inline>
+        </w:drawing>
+      </w:r>
+    </w:p>
+    <w:p>
+      <w:pPr>
+        <w:pStyle w:val="Caption"/>
+        <w:jc w:val="center"/>
+      </w:pPr>
+      <w:r>
+        <w:t>Figure 13. SSMS foreign-key evidence for EVENTS and PARTNERS.</w:t>
+      </w:r>
+    </w:p>
+    <w:p>
+      <w:pPr>
+        <w:spacing w:after="0"/>
+        <w:jc w:val="center"/>
+      </w:pPr>
+      <w:r>
+        <w:rPr>
+          <w:noProof/>
+        </w:rPr>
+        <w:lastRenderedPageBreak/>
+        <w:drawing>
+          <wp:inline distT="0" distB="0" distL="0" distR="0" wp14:anchorId="25E37402" wp14:editId="21E63789">
+            <wp:extent cx="6126480" cy="2904554"/>
+            <wp:effectExtent l="0" t="0" r="0" b="0"/>
+            <wp:docPr id="14" name="Picture 14" title="Figure 14" descr="Figure 14. Seeded client, partner and profession data, including leading-zero contact numbers."/>
+            <wp:cNvGraphicFramePr>
+              <a:graphicFrameLocks xmlns:a="http://schemas.openxmlformats.org/drawingml/2006/main" noChangeAspect="1"/>
+            </wp:cNvGraphicFramePr>
+            <a:graphic xmlns:a="http://schemas.openxmlformats.org/drawingml/2006/main">
+              <a:graphicData uri="http://schemas.openxmlformats.org/drawingml/2006/picture">
+                <pic:pic xmlns:pic="http://schemas.openxmlformats.org/drawingml/2006/picture">
+                  <pic:nvPicPr>
+                    <pic:cNvPr id="0" name="04-client-partner-profession-records.png"/>
+                    <pic:cNvPicPr/>
+                  </pic:nvPicPr>
+                  <pic:blipFill>
+                    <a:blip r:embed="rId21"/>
+                    <a:stretch>
+                      <a:fillRect/>
+                    </a:stretch>
+                  </pic:blipFill>
+                  <pic:spPr>
+                    <a:xfrm>
+                      <a:off x="0" y="0"/>
+                      <a:ext cx="6126480" cy="2904554"/>
+                    </a:xfrm>
+                    <a:prstGeom prst="rect">
+                      <a:avLst/>
+                    </a:prstGeom>
+                  </pic:spPr>
+                </pic:pic>
+              </a:graphicData>
+            </a:graphic>
+          </wp:inline>
+        </w:drawing>
+      </w:r>
+    </w:p>
+    <w:p>
+      <w:pPr>
+        <w:pStyle w:val="Caption"/>
+        <w:jc w:val="center"/>
+      </w:pPr>
+      <w:r>
+        <w:t>Figure 14. Seeded client, partner and profession data, including leading-zero contact numbers.</w:t>
+      </w:r>
+    </w:p>
+    <w:p>
+      <w:pPr>
+        <w:spacing w:after="0"/>
+        <w:jc w:val="center"/>
+      </w:pPr>
+      <w:r>
+        <w:rPr>
+          <w:noProof/>
+        </w:rPr>
+        <w:drawing>
+          <wp:inline distT="0" distB="0" distL="0" distR="0" wp14:anchorId="17ED4F33" wp14:editId="0604157F">
+            <wp:extent cx="6126480" cy="3254692"/>
+            <wp:effectExtent l="0" t="0" r="0" b="0"/>
+            <wp:docPr id="15" name="Picture 15" title="Figure 15" descr="Figure 15. Seeded venue and event data, including ratings and calculated costs."/>
+            <wp:cNvGraphicFramePr>
+              <a:graphicFrameLocks xmlns:a="http://schemas.openxmlformats.org/drawingml/2006/main" noChangeAspect="1"/>
+            </wp:cNvGraphicFramePr>
+            <a:graphic xmlns:a="http://schemas.openxmlformats.org/drawingml/2006/main">
+              <a:graphicData uri="http://schemas.openxmlformats.org/drawingml/2006/picture">
+                <pic:pic xmlns:pic="http://schemas.openxmlformats.org/drawingml/2006/picture">
+                  <pic:nvPicPr>
+                    <pic:cNvPr id="0" name="03-venue-and-event-records.png"/>
+                    <pic:cNvPicPr/>
+                  </pic:nvPicPr>
+                  <pic:blipFill>
+                    <a:blip r:embed="rId22"/>
+                    <a:stretch>
+                      <a:fillRect/>
+                    </a:stretch>
+                  </pic:blipFill>
+                  <pic:spPr>
+                    <a:xfrm>
+                      <a:off x="0" y="0"/>
+                      <a:ext cx="6126480" cy="3254692"/>
+                    </a:xfrm>
+                    <a:prstGeom prst="rect">
+                      <a:avLst/>
+                    </a:prstGeom>
+                  </pic:spPr>
+                </pic:pic>
+              </a:graphicData>
+            </a:graphic>
+          </wp:inline>
+        </w:drawing>
+      </w:r>
+    </w:p>
+    <w:p>
+      <w:pPr>
+        <w:pStyle w:val="Caption"/>
+        <w:jc w:val="center"/>
+      </w:pPr>
+      <w:r>
+        <w:t>Figure 15. Seeded venue and event data, including ratings and calculated costs.</w:t>
+      </w:r>
+    </w:p>
+    <w:p>
       <w:pPr>
         <w:pStyle w:val="Heading1"/>
       </w:pPr>
-      <w:bookmarkStart w:id="12" w:name="_Toc239235399"/>
+      <w:bookmarkStart w:id="12" w:name="_Toc239241962"/>
       <w:r>
         <w:lastRenderedPageBreak/>
         <w:t>13  Individual development record</w:t>
@@ -13803,6 +14043,190 @@
           </w:p>
         </w:tc>
       </w:tr>
+      <w:tr>
+        <w:trPr>
+          <w:jc w:val="center"/>
+        </w:trPr>
+        <w:tc>
+          <w:tcPr>
+            <w:tcW w:w="1296" w:type="dxa"/>
+            <w:tcBorders>
+              <w:top w:val="single" w:sz="6" w:space="0" w:color="B8C2CC"/>
+              <w:left w:val="single" w:sz="6" w:space="0" w:color="B8C2CC"/>
+              <w:bottom w:val="single" w:sz="6" w:space="0" w:color="B8C2CC"/>
+              <w:right w:val="single" w:sz="6" w:space="0" w:color="B8C2CC"/>
+            </w:tcBorders>
+            <w:shd w:val="clear" w:color="auto" w:fill="F4F7FA"/>
+            <w:tcMar>
+              <w:top w:w="70" w:type="dxa"/>
+              <w:left w:w="80" w:type="dxa"/>
+              <w:bottom w:w="70" w:type="dxa"/>
+              <w:right w:w="80" w:type="dxa"/>
+            </w:tcMar>
+          </w:tcPr>
+          <w:p>
+            <w:pPr>
+              <w:spacing w:after="0"/>
+            </w:pPr>
+            <w:r>
+              <w:rPr>
+                <w:sz w:val="16"/>
+              </w:rPr>
+              <w:t>735e4b7</w:t>
+            </w:r>
+          </w:p>
+        </w:tc>
+        <w:tc>
+          <w:tcPr>
+            <w:tcW w:w="2160" w:type="dxa"/>
+            <w:tcBorders>
+              <w:top w:val="single" w:sz="6" w:space="0" w:color="B8C2CC"/>
+              <w:left w:val="single" w:sz="6" w:space="0" w:color="B8C2CC"/>
+              <w:bottom w:val="single" w:sz="6" w:space="0" w:color="B8C2CC"/>
+              <w:right w:val="single" w:sz="6" w:space="0" w:color="B8C2CC"/>
+            </w:tcBorders>
+            <w:shd w:val="clear" w:color="auto" w:fill="F4F7FA"/>
+            <w:tcMar>
+              <w:top w:w="70" w:type="dxa"/>
+              <w:left w:w="80" w:type="dxa"/>
+              <w:bottom w:w="70" w:type="dxa"/>
+              <w:right w:w="80" w:type="dxa"/>
+            </w:tcMar>
+          </w:tcPr>
+          <w:p>
+            <w:pPr>
+              <w:spacing w:after="0"/>
+            </w:pPr>
+            <w:r>
+              <w:rPr>
+                <w:sz w:val="16"/>
+              </w:rPr>
+              <w:t>2026-09-02 10:01</w:t>
+            </w:r>
+          </w:p>
+        </w:tc>
+        <w:tc>
+          <w:tcPr>
+            <w:tcW w:w="6264" w:type="dxa"/>
+            <w:tcBorders>
+              <w:top w:val="single" w:sz="6" w:space="0" w:color="B8C2CC"/>
+              <w:left w:val="single" w:sz="6" w:space="0" w:color="B8C2CC"/>
+              <w:bottom w:val="single" w:sz="6" w:space="0" w:color="B8C2CC"/>
+              <w:right w:val="single" w:sz="6" w:space="0" w:color="B8C2CC"/>
+            </w:tcBorders>
+            <w:shd w:val="clear" w:color="auto" w:fill="F4F7FA"/>
+            <w:tcMar>
+              <w:top w:w="70" w:type="dxa"/>
+              <w:left w:w="80" w:type="dxa"/>
+              <w:bottom w:w="70" w:type="dxa"/>
+              <w:right w:w="80" w:type="dxa"/>
+            </w:tcMar>
+          </w:tcPr>
+          <w:p>
+            <w:pPr>
+              <w:spacing w:after="0"/>
+            </w:pPr>
+            <w:r>
+              <w:rPr>
+                <w:sz w:val="16"/>
+              </w:rPr>
+              <w:t>docs: finalize individual project documentation</w:t>
+            </w:r>
+          </w:p>
+        </w:tc>
+      </w:tr>
+      <w:tr>
+        <w:trPr>
+          <w:jc w:val="center"/>
+        </w:trPr>
+        <w:tc>
+          <w:tcPr>
+            <w:tcW w:w="1296" w:type="dxa"/>
+            <w:tcBorders>
+              <w:top w:val="single" w:sz="6" w:space="0" w:color="B8C2CC"/>
+              <w:left w:val="single" w:sz="6" w:space="0" w:color="B8C2CC"/>
+              <w:bottom w:val="single" w:sz="6" w:space="0" w:color="B8C2CC"/>
+              <w:right w:val="single" w:sz="6" w:space="0" w:color="B8C2CC"/>
+            </w:tcBorders>
+            <w:shd w:val="clear" w:color="auto" w:fill="FFFFFF"/>
+            <w:tcMar>
+              <w:top w:w="70" w:type="dxa"/>
+              <w:left w:w="80" w:type="dxa"/>
+              <w:bottom w:w="70" w:type="dxa"/>
+              <w:right w:w="80" w:type="dxa"/>
+            </w:tcMar>
+          </w:tcPr>
+          <w:p>
+            <w:pPr>
+              <w:spacing w:after="0"/>
+            </w:pPr>
+            <w:r>
+              <w:rPr>
+                <w:sz w:val="16"/>
+              </w:rPr>
+              <w:t>d9e4852</w:t>
+            </w:r>
+          </w:p>
+        </w:tc>
+        <w:tc>
+          <w:tcPr>
+            <w:tcW w:w="2160" w:type="dxa"/>
+            <w:tcBorders>
+              <w:top w:val="single" w:sz="6" w:space="0" w:color="B8C2CC"/>
+              <w:left w:val="single" w:sz="6" w:space="0" w:color="B8C2CC"/>
+              <w:bottom w:val="single" w:sz="6" w:space="0" w:color="B8C2CC"/>
+              <w:right w:val="single" w:sz="6" w:space="0" w:color="B8C2CC"/>
+            </w:tcBorders>
+            <w:shd w:val="clear" w:color="auto" w:fill="FFFFFF"/>
+            <w:tcMar>
+              <w:top w:w="70" w:type="dxa"/>
+              <w:left w:w="80" w:type="dxa"/>
+              <w:bottom w:w="70" w:type="dxa"/>
+              <w:right w:w="80" w:type="dxa"/>
+            </w:tcMar>
+          </w:tcPr>
+          <w:p>
+            <w:pPr>
+              <w:spacing w:after="0"/>
+            </w:pPr>
+            <w:r>
+              <w:rPr>
+                <w:sz w:val="16"/>
+              </w:rPr>
+              <w:t>2026-09-02 10:24</w:t>
+            </w:r>
+          </w:p>
+        </w:tc>
+        <w:tc>
+          <w:tcPr>
+            <w:tcW w:w="6264" w:type="dxa"/>
+            <w:tcBorders>
+              <w:top w:val="single" w:sz="6" w:space="0" w:color="B8C2CC"/>
+              <w:left w:val="single" w:sz="6" w:space="0" w:color="B8C2CC"/>
+              <w:bottom w:val="single" w:sz="6" w:space="0" w:color="B8C2CC"/>
+              <w:right w:val="single" w:sz="6" w:space="0" w:color="B8C2CC"/>
+            </w:tcBorders>
+            <w:shd w:val="clear" w:color="auto" w:fill="FFFFFF"/>
+            <w:tcMar>
+              <w:top w:w="70" w:type="dxa"/>
+              <w:left w:w="80" w:type="dxa"/>
+              <w:bottom w:w="70" w:type="dxa"/>
+              <w:right w:w="80" w:type="dxa"/>
+            </w:tcMar>
+          </w:tcPr>
+          <w:p>
+            <w:pPr>
+              <w:spacing w:after="0"/>
+            </w:pPr>
+            <w:r>
+              <w:rPr>
+                <w:sz w:val="16"/>
+              </w:rPr>
+              <w:t>fix: align venue ratings and clean stale UI</w:t>
+            </w:r>
+          </w:p>
+        </w:tc>
+      </w:tr>
     </w:tbl>
     <w:p>
       <w:pPr>
@@ -13821,7 +14245,7 @@
       <w:r>
         <w:t xml:space="preserve">Public repository: </w:t>
       </w:r>
-      <w:hyperlink r:id="rId19">
+      <w:hyperlink r:id="rId23">
         <w:r>
           <w:rPr>
             <w:color w:val="4472C4"/>
@@ -13840,7 +14264,7 @@
       <w:pPr>
         <w:pStyle w:val="Heading1"/>
       </w:pPr>
-      <w:bookmarkStart w:id="13" w:name="_Toc239235400"/>
+      <w:bookmarkStart w:id="13" w:name="_Toc239241963"/>
       <w:r>
         <w:lastRenderedPageBreak/>
         <w:t>14  Demonstration guide</w:t>
@@ -14606,7 +15030,7 @@
       <w:pPr>
         <w:pStyle w:val="Heading1"/>
       </w:pPr>
-      <w:bookmarkStart w:id="14" w:name="_Toc239235401"/>
+      <w:bookmarkStart w:id="14" w:name="_Toc239241964"/>
       <w:r>
         <w:lastRenderedPageBreak/>
         <w:t>15  Conclusion</w:t>
@@ -14673,10 +15097,10 @@
       </w:pPr>
     </w:p>
     <w:sectPr>
-      <w:headerReference w:type="default" r:id="rId20"/>
-      <w:footerReference w:type="default" r:id="rId21"/>
-      <w:headerReference w:type="first" r:id="rId22"/>
-      <w:footerReference w:type="first" r:id="rId23"/>
+      <w:headerReference w:type="default" r:id="rId24"/>
+      <w:footerReference w:type="default" r:id="rId25"/>
+      <w:headerReference w:type="first" r:id="rId26"/>
+      <w:footerReference w:type="first" r:id="rId27"/>
       <w:pgSz w:w="11909" w:h="16834"/>
       <w:pgMar w:top="1037" w:right="1080" w:bottom="936" w:left="1080" w:header="432" w:footer="403" w:gutter="0"/>
       <w:pgNumType w:start="0"/>
@@ -14997,31 +15421,31 @@
       </w:rPr>
     </w:lvl>
   </w:abstractNum>
-  <w:num w:numId="1" w16cid:durableId="430663967">
+  <w:num w:numId="1" w16cid:durableId="1043824378">
     <w:abstractNumId w:val="8"/>
   </w:num>
-  <w:num w:numId="2" w16cid:durableId="655182736">
+  <w:num w:numId="2" w16cid:durableId="1902671651">
     <w:abstractNumId w:val="6"/>
   </w:num>
-  <w:num w:numId="3" w16cid:durableId="1151290681">
+  <w:num w:numId="3" w16cid:durableId="1839231099">
     <w:abstractNumId w:val="5"/>
   </w:num>
-  <w:num w:numId="4" w16cid:durableId="414011629">
+  <w:num w:numId="4" w16cid:durableId="497962441">
     <w:abstractNumId w:val="4"/>
   </w:num>
-  <w:num w:numId="5" w16cid:durableId="72355678">
+  <w:num w:numId="5" w16cid:durableId="1086463164">
     <w:abstractNumId w:val="7"/>
   </w:num>
-  <w:num w:numId="6" w16cid:durableId="842087725">
+  <w:num w:numId="6" w16cid:durableId="1749880021">
     <w:abstractNumId w:val="3"/>
   </w:num>
-  <w:num w:numId="7" w16cid:durableId="270358149">
+  <w:num w:numId="7" w16cid:durableId="8534668">
     <w:abstractNumId w:val="2"/>
   </w:num>
-  <w:num w:numId="8" w16cid:durableId="1892424593">
+  <w:num w:numId="8" w16cid:durableId="1741363409">
     <w:abstractNumId w:val="1"/>
   </w:num>
-  <w:num w:numId="9" w16cid:durableId="2081322924">
+  <w:num w:numId="9" w16cid:durableId="1548909503">
     <w:abstractNumId w:val="0"/>
   </w:num>
 </w:numbering>
@@ -26426,7 +26850,7 @@
     <w:autoRedefine/>
     <w:uiPriority w:val="39"/>
     <w:unhideWhenUsed/>
-    <w:rsid w:val="00B212DC"/>
+    <w:rsid w:val="00284C92"/>
     <w:pPr>
       <w:spacing w:after="100"/>
     </w:pPr>
@@ -26436,7 +26860,7 @@
     <w:basedOn w:val="DefaultParagraphFont"/>
     <w:uiPriority w:val="99"/>
     <w:unhideWhenUsed/>
-    <w:rsid w:val="00B212DC"/>
+    <w:rsid w:val="00284C92"/>
     <w:rPr>
       <w:color w:val="0000FF" w:themeColor="hyperlink"/>
       <w:u w:val="single"/>

</xml_diff>